<commit_message>
POO S14 (Buenas practicas y refactorizacion): profundizacion rigurosa (SOLID intro, code smells)
</commit_message>
<xml_diff>
--- a/14-week/optional-activity/pdf/Actividad-Semana14.docx
+++ b/14-week/optional-activity/pdf/Actividad-Semana14.docx
@@ -31,7 +31,7 @@
           <w:sz w:val="22"/>
           <w:szCs w:val="22"/>
         </w:rPr>
-        <w:t xml:space="preserve">Programación y Diseño Orientado a Objetos · Semana 14 · Refactoriza un código</w:t>
+        <w:t xml:space="preserve">Programación y Diseño Orientado a Objetos · Semana 14 · Refactoriza aplicando buenas prácticas</w:t>
       </w:r>
     </w:p>
     <w:tbl>
@@ -454,7 +454,7 @@
           <w:sz w:val="22"/>
           <w:szCs w:val="22"/>
         </w:rPr>
-        <w:t xml:space="preserve">Aplicar extraer método, renombrar e introducir constantes.</w:t>
+        <w:t xml:space="preserve">Aplicar extraer método, renombrar, introducir constante y polimorfismo.</w:t>
       </w:r>
     </w:p>
     <w:p>
@@ -478,7 +478,7 @@
           <w:sz w:val="22"/>
           <w:szCs w:val="22"/>
         </w:rPr>
-        <w:t xml:space="preserve">Documentar el antes y el después.</w:t>
+        <w:t xml:space="preserve">Verificar que el comportamiento no cambió.</w:t>
       </w:r>
     </w:p>
     <w:p>
@@ -521,7 +521,44 @@
           <w:sz w:val="22"/>
           <w:szCs w:val="22"/>
         </w:rPr>
-        <w:t xml:space="preserve">Parte de un programa con un método largo, nombres pobres y números mágicos (créalo o usa uno tuyo).</w:t>
+        <w:t xml:space="preserve">Parte de un programa con </w:t>
+      </w:r>
+      <w:r>
+        <w:rPr>
+          <w:rFonts w:ascii="Times New Roman" w:hAnsi="Times New Roman" w:cs="Times New Roman"/>
+          <w:b/>
+          <w:color w:val="000000"/>
+          <w:sz w:val="22"/>
+          <w:szCs w:val="22"/>
+        </w:rPr>
+        <w:t xml:space="preserve">olores</w:t>
+      </w:r>
+      <w:r>
+        <w:rPr>
+          <w:rFonts w:ascii="Times New Roman" w:hAnsi="Times New Roman" w:cs="Times New Roman"/>
+          <w:color w:val="000000"/>
+          <w:sz w:val="22"/>
+          <w:szCs w:val="22"/>
+        </w:rPr>
+        <w:t xml:space="preserve">: nombres pobres, números mágicos, un método largo y un </w:t>
+      </w:r>
+      <w:r>
+        <w:rPr>
+          <w:rFonts w:ascii="Consolas" w:hAnsi="Consolas" w:cs="Consolas"/>
+          <w:color w:val="000000"/>
+          <w:sz w:val="22"/>
+          <w:szCs w:val="22"/>
+        </w:rPr>
+        <w:t xml:space="preserve">switch</w:t>
+      </w:r>
+      <w:r>
+        <w:rPr>
+          <w:rFonts w:ascii="Times New Roman" w:hAnsi="Times New Roman" w:cs="Times New Roman"/>
+          <w:color w:val="000000"/>
+          <w:sz w:val="22"/>
+          <w:szCs w:val="22"/>
+        </w:rPr>
+        <w:t xml:space="preserve"> por tipo (créalo o usa uno tuyo). Guarda su salida original.</w:t>
       </w:r>
     </w:p>
     <w:p>
@@ -555,16 +592,16 @@
           <w:sz w:val="22"/>
           <w:szCs w:val="22"/>
         </w:rPr>
-        <w:t xml:space="preserve">tres</w:t>
-      </w:r>
-      <w:r>
-        <w:rPr>
-          <w:rFonts w:ascii="Times New Roman" w:hAnsi="Times New Roman" w:cs="Times New Roman"/>
-          <w:color w:val="000000"/>
-          <w:sz w:val="22"/>
-          <w:szCs w:val="22"/>
-        </w:rPr>
-        <w:t xml:space="preserve"> refactorizaciones: extraer método, renombrar, introducir constante.</w:t>
+        <w:t xml:space="preserve">cuatro</w:t>
+      </w:r>
+      <w:r>
+        <w:rPr>
+          <w:rFonts w:ascii="Times New Roman" w:hAnsi="Times New Roman" w:cs="Times New Roman"/>
+          <w:color w:val="000000"/>
+          <w:sz w:val="22"/>
+          <w:szCs w:val="22"/>
+        </w:rPr>
+        <w:t xml:space="preserve"> refactorizaciones:</w:t>
       </w:r>
     </w:p>
     <w:p>
@@ -579,35 +616,16 @@
           <w:sz w:val="22"/>
           <w:szCs w:val="22"/>
         </w:rPr>
-        <w:t xml:space="preserve">3.	</w:t>
-      </w:r>
-      <w:r>
-        <w:rPr>
-          <w:rFonts w:ascii="Times New Roman" w:hAnsi="Times New Roman" w:cs="Times New Roman"/>
-          <w:color w:val="000000"/>
-          <w:sz w:val="22"/>
-          <w:szCs w:val="22"/>
-        </w:rPr>
-        <w:t xml:space="preserve">Verifica que el comportamiento </w:t>
-      </w:r>
-      <w:r>
-        <w:rPr>
-          <w:rFonts w:ascii="Times New Roman" w:hAnsi="Times New Roman" w:cs="Times New Roman"/>
-          <w:b/>
-          <w:color w:val="000000"/>
-          <w:sz w:val="22"/>
-          <w:szCs w:val="22"/>
-        </w:rPr>
-        <w:t xml:space="preserve">no cambió</w:t>
-      </w:r>
-      <w:r>
-        <w:rPr>
-          <w:rFonts w:ascii="Times New Roman" w:hAnsi="Times New Roman" w:cs="Times New Roman"/>
-          <w:color w:val="000000"/>
-          <w:sz w:val="22"/>
-          <w:szCs w:val="22"/>
-        </w:rPr>
-        <w:t xml:space="preserve"> (misma salida).</w:t>
+        <w:t xml:space="preserve">•	</w:t>
+      </w:r>
+      <w:r>
+        <w:rPr>
+          <w:rFonts w:ascii="Times New Roman" w:hAnsi="Times New Roman" w:cs="Times New Roman"/>
+          <w:color w:val="000000"/>
+          <w:sz w:val="22"/>
+          <w:szCs w:val="22"/>
+        </w:rPr>
+        <w:t xml:space="preserve">Renombrar (nombres que comunican).</w:t>
       </w:r>
     </w:p>
     <w:p>
@@ -622,16 +640,168 @@
           <w:sz w:val="22"/>
           <w:szCs w:val="22"/>
         </w:rPr>
-        <w:t xml:space="preserve">4.	</w:t>
-      </w:r>
-      <w:r>
-        <w:rPr>
-          <w:rFonts w:ascii="Times New Roman" w:hAnsi="Times New Roman" w:cs="Times New Roman"/>
-          <w:color w:val="000000"/>
-          <w:sz w:val="22"/>
-          <w:szCs w:val="22"/>
-        </w:rPr>
-        <w:t xml:space="preserve">Documenta en el README el "antes y después" y qué olores corregiste.</w:t>
+        <w:t xml:space="preserve">•	</w:t>
+      </w:r>
+      <w:r>
+        <w:rPr>
+          <w:rFonts w:ascii="Times New Roman" w:hAnsi="Times New Roman" w:cs="Times New Roman"/>
+          <w:color w:val="000000"/>
+          <w:sz w:val="22"/>
+          <w:szCs w:val="22"/>
+        </w:rPr>
+        <w:t xml:space="preserve">Introducir constante (eliminar números mágicos).</w:t>
+      </w:r>
+    </w:p>
+    <w:p>
+      <w:pPr>
+        <w:spacing w:after="120" w:line="276" w:lineRule="auto"/>
+        <w:ind w:left="454" w:hanging="284"/>
+      </w:pPr>
+      <w:r>
+        <w:rPr>
+          <w:rFonts w:ascii="Times New Roman" w:hAnsi="Times New Roman" w:cs="Times New Roman"/>
+          <w:color w:val="000000"/>
+          <w:sz w:val="22"/>
+          <w:szCs w:val="22"/>
+        </w:rPr>
+        <w:t xml:space="preserve">•	</w:t>
+      </w:r>
+      <w:r>
+        <w:rPr>
+          <w:rFonts w:ascii="Times New Roman" w:hAnsi="Times New Roman" w:cs="Times New Roman"/>
+          <w:color w:val="000000"/>
+          <w:sz w:val="22"/>
+          <w:szCs w:val="22"/>
+        </w:rPr>
+        <w:t xml:space="preserve">Extraer método (dividir el método largo).</w:t>
+      </w:r>
+    </w:p>
+    <w:p>
+      <w:pPr>
+        <w:spacing w:after="120" w:line="276" w:lineRule="auto"/>
+        <w:ind w:left="454" w:hanging="284"/>
+      </w:pPr>
+      <w:r>
+        <w:rPr>
+          <w:rFonts w:ascii="Times New Roman" w:hAnsi="Times New Roman" w:cs="Times New Roman"/>
+          <w:color w:val="000000"/>
+          <w:sz w:val="22"/>
+          <w:szCs w:val="22"/>
+        </w:rPr>
+        <w:t xml:space="preserve">•	</w:t>
+      </w:r>
+      <w:r>
+        <w:rPr>
+          <w:rFonts w:ascii="Times New Roman" w:hAnsi="Times New Roman" w:cs="Times New Roman"/>
+          <w:color w:val="000000"/>
+          <w:sz w:val="22"/>
+          <w:szCs w:val="22"/>
+        </w:rPr>
+        <w:t xml:space="preserve">Reemplazar el </w:t>
+      </w:r>
+      <w:r>
+        <w:rPr>
+          <w:rFonts w:ascii="Consolas" w:hAnsi="Consolas" w:cs="Consolas"/>
+          <w:color w:val="000000"/>
+          <w:sz w:val="22"/>
+          <w:szCs w:val="22"/>
+        </w:rPr>
+        <w:t xml:space="preserve">switch</w:t>
+      </w:r>
+      <w:r>
+        <w:rPr>
+          <w:rFonts w:ascii="Times New Roman" w:hAnsi="Times New Roman" w:cs="Times New Roman"/>
+          <w:color w:val="000000"/>
+          <w:sz w:val="22"/>
+          <w:szCs w:val="22"/>
+        </w:rPr>
+        <w:t xml:space="preserve"> por </w:t>
+      </w:r>
+      <w:r>
+        <w:rPr>
+          <w:rFonts w:ascii="Times New Roman" w:hAnsi="Times New Roman" w:cs="Times New Roman"/>
+          <w:b/>
+          <w:color w:val="000000"/>
+          <w:sz w:val="22"/>
+          <w:szCs w:val="22"/>
+        </w:rPr>
+        <w:t xml:space="preserve">polimorfismo</w:t>
+      </w:r>
+      <w:r>
+        <w:rPr>
+          <w:rFonts w:ascii="Times New Roman" w:hAnsi="Times New Roman" w:cs="Times New Roman"/>
+          <w:color w:val="000000"/>
+          <w:sz w:val="22"/>
+          <w:szCs w:val="22"/>
+        </w:rPr>
+        <w:t xml:space="preserve">.</w:t>
+      </w:r>
+    </w:p>
+    <w:p>
+      <w:pPr>
+        <w:spacing w:after="120" w:line="276" w:lineRule="auto"/>
+        <w:ind w:left="454" w:hanging="284"/>
+      </w:pPr>
+      <w:r>
+        <w:rPr>
+          <w:rFonts w:ascii="Times New Roman" w:hAnsi="Times New Roman" w:cs="Times New Roman"/>
+          <w:color w:val="000000"/>
+          <w:sz w:val="22"/>
+          <w:szCs w:val="22"/>
+        </w:rPr>
+        <w:t xml:space="preserve">1.	</w:t>
+      </w:r>
+      <w:r>
+        <w:rPr>
+          <w:rFonts w:ascii="Times New Roman" w:hAnsi="Times New Roman" w:cs="Times New Roman"/>
+          <w:color w:val="000000"/>
+          <w:sz w:val="22"/>
+          <w:szCs w:val="22"/>
+        </w:rPr>
+        <w:t xml:space="preserve">Verifica que la </w:t>
+      </w:r>
+      <w:r>
+        <w:rPr>
+          <w:rFonts w:ascii="Times New Roman" w:hAnsi="Times New Roman" w:cs="Times New Roman"/>
+          <w:b/>
+          <w:color w:val="000000"/>
+          <w:sz w:val="22"/>
+          <w:szCs w:val="22"/>
+        </w:rPr>
+        <w:t xml:space="preserve">salida es idéntica</w:t>
+      </w:r>
+      <w:r>
+        <w:rPr>
+          <w:rFonts w:ascii="Times New Roman" w:hAnsi="Times New Roman" w:cs="Times New Roman"/>
+          <w:color w:val="000000"/>
+          <w:sz w:val="22"/>
+          <w:szCs w:val="22"/>
+        </w:rPr>
+        <w:t xml:space="preserve"> a la original (misma entrada → misma salida).</w:t>
+      </w:r>
+    </w:p>
+    <w:p>
+      <w:pPr>
+        <w:spacing w:after="120" w:line="276" w:lineRule="auto"/>
+        <w:ind w:left="454" w:hanging="284"/>
+      </w:pPr>
+      <w:r>
+        <w:rPr>
+          <w:rFonts w:ascii="Times New Roman" w:hAnsi="Times New Roman" w:cs="Times New Roman"/>
+          <w:color w:val="000000"/>
+          <w:sz w:val="22"/>
+          <w:szCs w:val="22"/>
+        </w:rPr>
+        <w:t xml:space="preserve">2.	</w:t>
+      </w:r>
+      <w:r>
+        <w:rPr>
+          <w:rFonts w:ascii="Times New Roman" w:hAnsi="Times New Roman" w:cs="Times New Roman"/>
+          <w:color w:val="000000"/>
+          <w:sz w:val="22"/>
+          <w:szCs w:val="22"/>
+        </w:rPr>
+        <w:t xml:space="preserve">Documenta en el README el "antes y después" y qué olor corrigió cada refactor.</w:t>
       </w:r>
     </w:p>
     <w:p>
@@ -674,7 +844,7 @@
           <w:sz w:val="22"/>
           <w:szCs w:val="22"/>
         </w:rPr>
-        <w:t xml:space="preserve">Al menos 3 refactorizaciones aplicadas.</w:t>
+        <w:t xml:space="preserve">Al menos 4 refactorizaciones aplicadas, incluida la de polimorfismo.</w:t>
       </w:r>
     </w:p>
     <w:p>
@@ -698,7 +868,7 @@
           <w:sz w:val="22"/>
           <w:szCs w:val="22"/>
         </w:rPr>
-        <w:t xml:space="preserve">Comportamiento idéntico antes y después.</w:t>
+        <w:t xml:space="preserve">Comportamiento preservado (evidencia: salida antes = después).</w:t>
       </w:r>
     </w:p>
     <w:p>
@@ -825,7 +995,7 @@
           <w:sz w:val="18"/>
           <w:szCs w:val="18"/>
         </w:rPr>
-        <w:t xml:space="preserve">  README.md   -&gt; antes/despues + olores corregidos</w:t>
+        <w:t xml:space="preserve">  README.md   -&gt; antes/despues + olores corregidos + evidencia de salida</w:t>
       </w:r>
     </w:p>
     <w:p>
@@ -865,7 +1035,7 @@
           <w:sz w:val="22"/>
           <w:szCs w:val="22"/>
         </w:rPr>
-        <w:t xml:space="preserve">Crea el repo público con ese nombre.</w:t>
+        <w:t xml:space="preserve">Crea el repositorio público con ese nombre.</w:t>
       </w:r>
     </w:p>
     <w:p>
@@ -913,7 +1083,7 @@
           <w:sz w:val="22"/>
           <w:szCs w:val="22"/>
         </w:rPr>
-        <w:t xml:space="preserve">Comparte el enlace por el canal indicado.</w:t>
+        <w:t xml:space="preserve">Comparte el enlace por el canal indicado por el docente.</w:t>
       </w:r>
     </w:p>
     <w:p>
@@ -996,7 +1166,7 @@
                 <w:sz w:val="20"/>
                 <w:szCs w:val="20"/>
               </w:rPr>
-              <w:t xml:space="preserve">Excelente</w:t>
+              <w:t xml:space="preserve">Excelente (100%)</w:t>
             </w:r>
           </w:p>
         </w:tc>
@@ -1018,7 +1188,7 @@
                 <w:sz w:val="20"/>
                 <w:szCs w:val="20"/>
               </w:rPr>
-              <w:t xml:space="preserve">Aceptable</w:t>
+              <w:t xml:space="preserve">Aceptable (60%)</w:t>
             </w:r>
           </w:p>
         </w:tc>
@@ -1040,7 +1210,7 @@
                 <w:sz w:val="20"/>
                 <w:szCs w:val="20"/>
               </w:rPr>
-              <w:t xml:space="preserve">Por mejorar</w:t>
+              <w:t xml:space="preserve">Por mejorar (0%)</w:t>
             </w:r>
           </w:p>
         </w:tc>
@@ -1084,7 +1254,7 @@
                 <w:sz w:val="20"/>
                 <w:szCs w:val="20"/>
               </w:rPr>
-              <w:t xml:space="preserve">Refactorizaciones (3+)</w:t>
+              <w:t xml:space="preserve">Refactorizaciones (4+, incl. polimorfismo)</w:t>
             </w:r>
           </w:p>
         </w:tc>
@@ -1124,7 +1294,7 @@
                 <w:sz w:val="20"/>
                 <w:szCs w:val="20"/>
               </w:rPr>
-              <w:t xml:space="preserve">1–2</w:t>
+              <w:t xml:space="preserve">2–3</w:t>
             </w:r>
           </w:p>
         </w:tc>
@@ -1206,7 +1376,7 @@
                 <w:sz w:val="20"/>
                 <w:szCs w:val="20"/>
               </w:rPr>
-              <w:t xml:space="preserve">Idéntico</w:t>
+              <w:t xml:space="preserve">Idéntico (evidenciado)</w:t>
             </w:r>
           </w:p>
         </w:tc>
@@ -1308,7 +1478,7 @@
                 <w:sz w:val="20"/>
                 <w:szCs w:val="20"/>
               </w:rPr>
-              <w:t xml:space="preserve">Clara</w:t>
+              <w:t xml:space="preserve">Clara por cada olor</w:t>
             </w:r>
           </w:p>
         </w:tc>
@@ -1489,7 +1659,7 @@
           <w:sz w:val="21"/>
           <w:szCs w:val="21"/>
         </w:rPr>
-        <w:t xml:space="preserve">Nota: actividad formativa y opcional (sin nota en Moodle). La guía unificada de entrega estará en el Manual de Entrega de Actividades Opcionales (próximamente).</w:t>
+        <w:t xml:space="preserve">Nota: actividad formativa y opcional (sin nota en Moodle). La guía unificada para entregar todas las actividades opcionales, válida para todas las materias, estará en el Manual de Entrega de Actividades Opcionales (próximamente).</w:t>
       </w:r>
     </w:p>
     <w:sectPr>

</xml_diff>